<commit_message>
Mindre uppdatering på ppt-mallen, plus lite bortstädning av filer.
</commit_message>
<xml_diff>
--- a/templates/Wordmall-how-to.docx
+++ b/templates/Wordmall-how-to.docx
@@ -247,7 +247,7 @@
           <w:noProof/>
         </w:rPr>
         <w:drawing>
-          <wp:inline distT="0" distB="0" distL="0" distR="0" wp14:anchorId="26DBDD06" wp14:editId="51DCC9C3">
+          <wp:inline distT="0" distB="0" distL="0" distR="0" wp14:anchorId="26DBDD06" wp14:editId="75B18347">
             <wp:extent cx="3327400" cy="254000"/>
             <wp:effectExtent l="0" t="0" r="0" b="0"/>
             <wp:docPr id="2015819221" name="Picture 18"/>
@@ -437,7 +437,7 @@
           <w:noProof/>
         </w:rPr>
         <w:drawing>
-          <wp:anchor distT="0" distB="0" distL="114300" distR="114300" simplePos="0" relativeHeight="251655680" behindDoc="1" locked="0" layoutInCell="1" allowOverlap="1" wp14:anchorId="01DD9DB0" wp14:editId="568F487D">
+          <wp:anchor distT="0" distB="0" distL="114300" distR="114300" simplePos="0" relativeHeight="251655680" behindDoc="1" locked="0" layoutInCell="1" allowOverlap="1" wp14:anchorId="01DD9DB0" wp14:editId="318FD37F">
             <wp:simplePos x="0" y="0"/>
             <wp:positionH relativeFrom="column">
               <wp:posOffset>3494616</wp:posOffset>
@@ -525,6 +525,82 @@
       <w:proofErr w:type="spellEnd"/>
       <w:r>
         <w:t xml:space="preserve"> är snarlik grundtabellen.</w:t>
+      </w:r>
+    </w:p>
+    <w:p>
+      <w:pPr>
+        <w:pStyle w:val="BodyText"/>
+      </w:pPr>
+      <w:r>
+        <w:rPr>
+          <w:noProof/>
+        </w:rPr>
+        <w:drawing>
+          <wp:anchor distT="0" distB="0" distL="114300" distR="114300" simplePos="0" relativeHeight="251661824" behindDoc="1" locked="0" layoutInCell="1" allowOverlap="1" wp14:anchorId="33313954" wp14:editId="09EF0497">
+            <wp:simplePos x="0" y="0"/>
+            <wp:positionH relativeFrom="column">
+              <wp:posOffset>3326765</wp:posOffset>
+            </wp:positionH>
+            <wp:positionV relativeFrom="paragraph">
+              <wp:posOffset>98425</wp:posOffset>
+            </wp:positionV>
+            <wp:extent cx="2215515" cy="339090"/>
+            <wp:effectExtent l="0" t="0" r="0" b="3810"/>
+            <wp:wrapTight wrapText="bothSides">
+              <wp:wrapPolygon edited="0">
+                <wp:start x="0" y="0"/>
+                <wp:lineTo x="0" y="21034"/>
+                <wp:lineTo x="21420" y="21034"/>
+                <wp:lineTo x="21420" y="0"/>
+                <wp:lineTo x="0" y="0"/>
+              </wp:wrapPolygon>
+            </wp:wrapTight>
+            <wp:docPr id="931409569" name="Picture 9"/>
+            <wp:cNvGraphicFramePr>
+              <a:graphicFrameLocks xmlns:a="http://schemas.openxmlformats.org/drawingml/2006/main" noChangeAspect="1"/>
+            </wp:cNvGraphicFramePr>
+            <a:graphic xmlns:a="http://schemas.openxmlformats.org/drawingml/2006/main">
+              <a:graphicData uri="http://schemas.openxmlformats.org/drawingml/2006/picture">
+                <pic:pic xmlns:pic="http://schemas.openxmlformats.org/drawingml/2006/picture">
+                  <pic:nvPicPr>
+                    <pic:cNvPr id="931409569" name="Picture 931409569"/>
+                    <pic:cNvPicPr/>
+                  </pic:nvPicPr>
+                  <pic:blipFill>
+                    <a:blip r:embed="rId14" cstate="print">
+                      <a:extLst>
+                        <a:ext uri="{28A0092B-C50C-407E-A947-70E740481C1C}">
+                          <a14:useLocalDpi xmlns:a14="http://schemas.microsoft.com/office/drawing/2010/main" val="0"/>
+                        </a:ext>
+                      </a:extLst>
+                    </a:blip>
+                    <a:stretch>
+                      <a:fillRect/>
+                    </a:stretch>
+                  </pic:blipFill>
+                  <pic:spPr>
+                    <a:xfrm>
+                      <a:off x="0" y="0"/>
+                      <a:ext cx="2215515" cy="339090"/>
+                    </a:xfrm>
+                    <a:prstGeom prst="rect">
+                      <a:avLst/>
+                    </a:prstGeom>
+                  </pic:spPr>
+                </pic:pic>
+              </a:graphicData>
+            </a:graphic>
+            <wp14:sizeRelH relativeFrom="page">
+              <wp14:pctWidth>0</wp14:pctWidth>
+            </wp14:sizeRelH>
+            <wp14:sizeRelV relativeFrom="page">
+              <wp14:pctHeight>0</wp14:pctHeight>
+            </wp14:sizeRelV>
+          </wp:anchor>
+        </w:drawing>
+      </w:r>
+      <w:r>
+        <w:t>Notera att du kan ändra tabellen under Table design klicka i och ur hur kolumner och rader ska användas.</w:t>
       </w:r>
     </w:p>
     <w:p>
@@ -847,7 +923,7 @@
           <w:noProof/>
         </w:rPr>
         <w:drawing>
-          <wp:anchor distT="0" distB="0" distL="114300" distR="114300" simplePos="0" relativeHeight="251658752" behindDoc="1" locked="0" layoutInCell="1" allowOverlap="1" wp14:anchorId="2DF72807" wp14:editId="0876F485">
+          <wp:anchor distT="0" distB="0" distL="114300" distR="114300" simplePos="0" relativeHeight="251658752" behindDoc="1" locked="0" layoutInCell="1" allowOverlap="1" wp14:anchorId="2DF72807" wp14:editId="4C7D9CA3">
             <wp:simplePos x="0" y="0"/>
             <wp:positionH relativeFrom="column">
               <wp:posOffset>3695911</wp:posOffset>
@@ -880,7 +956,7 @@
                     </pic:cNvPicPr>
                   </pic:nvPicPr>
                   <pic:blipFill>
-                    <a:blip r:embed="rId14" cstate="print">
+                    <a:blip r:embed="rId15" cstate="print">
                       <a:extLst>
                         <a:ext uri="{28A0092B-C50C-407E-A947-70E740481C1C}">
                           <a14:useLocalDpi xmlns:a14="http://schemas.microsoft.com/office/drawing/2010/main" val="0"/>
@@ -1212,7 +1288,7 @@
           <w:noProof/>
         </w:rPr>
         <w:drawing>
-          <wp:anchor distT="0" distB="0" distL="114300" distR="114300" simplePos="0" relativeHeight="251654656" behindDoc="1" locked="0" layoutInCell="1" allowOverlap="1" wp14:anchorId="7DC76C22" wp14:editId="436157ED">
+          <wp:anchor distT="0" distB="0" distL="114300" distR="114300" simplePos="0" relativeHeight="251654656" behindDoc="1" locked="0" layoutInCell="1" allowOverlap="1" wp14:anchorId="7DC76C22" wp14:editId="7C68687E">
             <wp:simplePos x="0" y="0"/>
             <wp:positionH relativeFrom="column">
               <wp:posOffset>3763433</wp:posOffset>
@@ -1245,7 +1321,7 @@
                     </pic:cNvPicPr>
                   </pic:nvPicPr>
                   <pic:blipFill>
-                    <a:blip r:embed="rId15" cstate="print">
+                    <a:blip r:embed="rId16" cstate="print">
                       <a:extLst>
                         <a:ext uri="{28A0092B-C50C-407E-A947-70E740481C1C}">
                           <a14:useLocalDpi xmlns:a14="http://schemas.microsoft.com/office/drawing/2010/main" val="0"/>
@@ -1357,7 +1433,6 @@
               </w:rPr>
             </w:pPr>
             <w:r>
-              <w:lastRenderedPageBreak/>
               <w:t>Version</w:t>
             </w:r>
           </w:p>
@@ -1560,10 +1635,10 @@
                           <a:avLst/>
                         </a:prstGeom>
                         <a:blipFill>
-                          <a:blip r:embed="rId16">
+                          <a:blip r:embed="rId17">
                             <a:extLst>
                               <a:ext uri="{96DAC541-7B7A-43D3-8B79-37D633B846F1}">
-                                <asvg:svgBlip xmlns:asvg="http://schemas.microsoft.com/office/drawing/2016/SVG/main" r:embed="rId17"/>
+                                <asvg:svgBlip xmlns:asvg="http://schemas.microsoft.com/office/drawing/2016/SVG/main" r:embed="rId18"/>
                               </a:ext>
                             </a:extLst>
                           </a:blip>
@@ -1629,7 +1704,7 @@
                 <v:path gradientshapeok="t" o:connecttype="rect"/>
               </v:shapetype>
               <v:shape id="Text Box 22" o:spid="_x0000_s1026" type="#_x0000_t202" style="position:absolute;margin-left:261.95pt;margin-top:20.8pt;width:58pt;height:64.65pt;z-index:251658240;visibility:visible;mso-wrap-style:square;mso-width-percent:0;mso-height-percent:0;mso-wrap-distance-left:9pt;mso-wrap-distance-top:0;mso-wrap-distance-right:9pt;mso-wrap-distance-bottom:0;mso-position-horizontal:absolute;mso-position-horizontal-relative:text;mso-position-vertical:absolute;mso-position-vertical-relative:text;mso-width-percent:0;mso-height-percent:0;mso-width-relative:margin;mso-height-relative:margin;v-text-anchor:top" o:gfxdata="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" stroked="f">
-                <v:fill r:id="rId18" o:title="" recolor="t" rotate="t" type="frame"/>
+                <v:fill r:id="rId19" o:title="" recolor="t" rotate="t" type="frame"/>
                 <v:textbox inset="3mm,1mm,3mm,3mm">
                   <w:txbxContent>
                     <w:p>
@@ -2386,10 +2461,10 @@
                     </pic:cNvPicPr>
                   </pic:nvPicPr>
                   <pic:blipFill>
-                    <a:blip r:embed="rId19">
+                    <a:blip r:embed="rId20">
                       <a:extLst>
                         <a:ext uri="{96DAC541-7B7A-43D3-8B79-37D633B846F1}">
-                          <asvg:svgBlip xmlns:asvg="http://schemas.microsoft.com/office/drawing/2016/SVG/main" r:embed="rId20"/>
+                          <asvg:svgBlip xmlns:asvg="http://schemas.microsoft.com/office/drawing/2016/SVG/main" r:embed="rId21"/>
                         </a:ext>
                       </a:extLst>
                     </a:blip>
@@ -2433,10 +2508,10 @@
                     </pic:cNvPicPr>
                   </pic:nvPicPr>
                   <pic:blipFill>
-                    <a:blip r:embed="rId21">
+                    <a:blip r:embed="rId22">
                       <a:extLst>
                         <a:ext uri="{96DAC541-7B7A-43D3-8B79-37D633B846F1}">
-                          <asvg:svgBlip xmlns:asvg="http://schemas.microsoft.com/office/drawing/2016/SVG/main" r:embed="rId22"/>
+                          <asvg:svgBlip xmlns:asvg="http://schemas.microsoft.com/office/drawing/2016/SVG/main" r:embed="rId23"/>
                         </a:ext>
                       </a:extLst>
                     </a:blip>
@@ -2480,10 +2555,10 @@
                     </pic:cNvPicPr>
                   </pic:nvPicPr>
                   <pic:blipFill>
-                    <a:blip r:embed="rId23">
+                    <a:blip r:embed="rId24">
                       <a:extLst>
                         <a:ext uri="{96DAC541-7B7A-43D3-8B79-37D633B846F1}">
-                          <asvg:svgBlip xmlns:asvg="http://schemas.microsoft.com/office/drawing/2016/SVG/main" r:embed="rId24"/>
+                          <asvg:svgBlip xmlns:asvg="http://schemas.microsoft.com/office/drawing/2016/SVG/main" r:embed="rId25"/>
                         </a:ext>
                       </a:extLst>
                     </a:blip>
@@ -2527,10 +2602,10 @@
                     </pic:cNvPicPr>
                   </pic:nvPicPr>
                   <pic:blipFill>
-                    <a:blip r:embed="rId25">
+                    <a:blip r:embed="rId26">
                       <a:extLst>
                         <a:ext uri="{96DAC541-7B7A-43D3-8B79-37D633B846F1}">
-                          <asvg:svgBlip xmlns:asvg="http://schemas.microsoft.com/office/drawing/2016/SVG/main" r:embed="rId26"/>
+                          <asvg:svgBlip xmlns:asvg="http://schemas.microsoft.com/office/drawing/2016/SVG/main" r:embed="rId27"/>
                         </a:ext>
                       </a:extLst>
                     </a:blip>
@@ -2574,10 +2649,10 @@
                     </pic:cNvPicPr>
                   </pic:nvPicPr>
                   <pic:blipFill>
-                    <a:blip r:embed="rId27">
+                    <a:blip r:embed="rId28">
                       <a:extLst>
                         <a:ext uri="{96DAC541-7B7A-43D3-8B79-37D633B846F1}">
-                          <asvg:svgBlip xmlns:asvg="http://schemas.microsoft.com/office/drawing/2016/SVG/main" r:embed="rId28"/>
+                          <asvg:svgBlip xmlns:asvg="http://schemas.microsoft.com/office/drawing/2016/SVG/main" r:embed="rId29"/>
                         </a:ext>
                       </a:extLst>
                     </a:blip>
@@ -2621,10 +2696,10 @@
                     </pic:cNvPicPr>
                   </pic:nvPicPr>
                   <pic:blipFill>
-                    <a:blip r:embed="rId29">
+                    <a:blip r:embed="rId30">
                       <a:extLst>
                         <a:ext uri="{96DAC541-7B7A-43D3-8B79-37D633B846F1}">
-                          <asvg:svgBlip xmlns:asvg="http://schemas.microsoft.com/office/drawing/2016/SVG/main" r:embed="rId30"/>
+                          <asvg:svgBlip xmlns:asvg="http://schemas.microsoft.com/office/drawing/2016/SVG/main" r:embed="rId31"/>
                         </a:ext>
                       </a:extLst>
                     </a:blip>
@@ -2668,10 +2743,10 @@
                     </pic:cNvPicPr>
                   </pic:nvPicPr>
                   <pic:blipFill>
-                    <a:blip r:embed="rId31">
+                    <a:blip r:embed="rId32">
                       <a:extLst>
                         <a:ext uri="{96DAC541-7B7A-43D3-8B79-37D633B846F1}">
-                          <asvg:svgBlip xmlns:asvg="http://schemas.microsoft.com/office/drawing/2016/SVG/main" r:embed="rId32"/>
+                          <asvg:svgBlip xmlns:asvg="http://schemas.microsoft.com/office/drawing/2016/SVG/main" r:embed="rId33"/>
                         </a:ext>
                       </a:extLst>
                     </a:blip>
@@ -2715,10 +2790,10 @@
                     </pic:cNvPicPr>
                   </pic:nvPicPr>
                   <pic:blipFill>
-                    <a:blip r:embed="rId33">
+                    <a:blip r:embed="rId34">
                       <a:extLst>
                         <a:ext uri="{96DAC541-7B7A-43D3-8B79-37D633B846F1}">
-                          <asvg:svgBlip xmlns:asvg="http://schemas.microsoft.com/office/drawing/2016/SVG/main" r:embed="rId34"/>
+                          <asvg:svgBlip xmlns:asvg="http://schemas.microsoft.com/office/drawing/2016/SVG/main" r:embed="rId35"/>
                         </a:ext>
                       </a:extLst>
                     </a:blip>
@@ -2778,10 +2853,10 @@
                     </pic:cNvPicPr>
                   </pic:nvPicPr>
                   <pic:blipFill>
-                    <a:blip r:embed="rId35">
+                    <a:blip r:embed="rId36">
                       <a:extLst>
                         <a:ext uri="{96DAC541-7B7A-43D3-8B79-37D633B846F1}">
-                          <asvg:svgBlip xmlns:asvg="http://schemas.microsoft.com/office/drawing/2016/SVG/main" r:embed="rId36"/>
+                          <asvg:svgBlip xmlns:asvg="http://schemas.microsoft.com/office/drawing/2016/SVG/main" r:embed="rId37"/>
                         </a:ext>
                       </a:extLst>
                     </a:blip>
@@ -2825,10 +2900,10 @@
                     </pic:cNvPicPr>
                   </pic:nvPicPr>
                   <pic:blipFill>
-                    <a:blip r:embed="rId37">
+                    <a:blip r:embed="rId38">
                       <a:extLst>
                         <a:ext uri="{96DAC541-7B7A-43D3-8B79-37D633B846F1}">
-                          <asvg:svgBlip xmlns:asvg="http://schemas.microsoft.com/office/drawing/2016/SVG/main" r:embed="rId38"/>
+                          <asvg:svgBlip xmlns:asvg="http://schemas.microsoft.com/office/drawing/2016/SVG/main" r:embed="rId39"/>
                         </a:ext>
                       </a:extLst>
                     </a:blip>
@@ -2872,10 +2947,10 @@
                     </pic:cNvPicPr>
                   </pic:nvPicPr>
                   <pic:blipFill>
-                    <a:blip r:embed="rId39">
+                    <a:blip r:embed="rId40">
                       <a:extLst>
                         <a:ext uri="{96DAC541-7B7A-43D3-8B79-37D633B846F1}">
-                          <asvg:svgBlip xmlns:asvg="http://schemas.microsoft.com/office/drawing/2016/SVG/main" r:embed="rId40"/>
+                          <asvg:svgBlip xmlns:asvg="http://schemas.microsoft.com/office/drawing/2016/SVG/main" r:embed="rId41"/>
                         </a:ext>
                       </a:extLst>
                     </a:blip>
@@ -2919,10 +2994,10 @@
                     </pic:cNvPicPr>
                   </pic:nvPicPr>
                   <pic:blipFill>
-                    <a:blip r:embed="rId41">
+                    <a:blip r:embed="rId42">
                       <a:extLst>
                         <a:ext uri="{96DAC541-7B7A-43D3-8B79-37D633B846F1}">
-                          <asvg:svgBlip xmlns:asvg="http://schemas.microsoft.com/office/drawing/2016/SVG/main" r:embed="rId42"/>
+                          <asvg:svgBlip xmlns:asvg="http://schemas.microsoft.com/office/drawing/2016/SVG/main" r:embed="rId43"/>
                         </a:ext>
                       </a:extLst>
                     </a:blip>
@@ -2966,10 +3041,10 @@
                     </pic:cNvPicPr>
                   </pic:nvPicPr>
                   <pic:blipFill>
-                    <a:blip r:embed="rId43">
+                    <a:blip r:embed="rId44">
                       <a:extLst>
                         <a:ext uri="{96DAC541-7B7A-43D3-8B79-37D633B846F1}">
-                          <asvg:svgBlip xmlns:asvg="http://schemas.microsoft.com/office/drawing/2016/SVG/main" r:embed="rId44"/>
+                          <asvg:svgBlip xmlns:asvg="http://schemas.microsoft.com/office/drawing/2016/SVG/main" r:embed="rId45"/>
                         </a:ext>
                       </a:extLst>
                     </a:blip>
@@ -3013,10 +3088,10 @@
                     </pic:cNvPicPr>
                   </pic:nvPicPr>
                   <pic:blipFill>
-                    <a:blip r:embed="rId45">
+                    <a:blip r:embed="rId46">
                       <a:extLst>
                         <a:ext uri="{96DAC541-7B7A-43D3-8B79-37D633B846F1}">
-                          <asvg:svgBlip xmlns:asvg="http://schemas.microsoft.com/office/drawing/2016/SVG/main" r:embed="rId46"/>
+                          <asvg:svgBlip xmlns:asvg="http://schemas.microsoft.com/office/drawing/2016/SVG/main" r:embed="rId47"/>
                         </a:ext>
                       </a:extLst>
                     </a:blip>
@@ -3060,10 +3135,10 @@
                     </pic:cNvPicPr>
                   </pic:nvPicPr>
                   <pic:blipFill>
-                    <a:blip r:embed="rId47">
+                    <a:blip r:embed="rId48">
                       <a:extLst>
                         <a:ext uri="{96DAC541-7B7A-43D3-8B79-37D633B846F1}">
-                          <asvg:svgBlip xmlns:asvg="http://schemas.microsoft.com/office/drawing/2016/SVG/main" r:embed="rId48"/>
+                          <asvg:svgBlip xmlns:asvg="http://schemas.microsoft.com/office/drawing/2016/SVG/main" r:embed="rId49"/>
                         </a:ext>
                       </a:extLst>
                     </a:blip>
@@ -3107,10 +3182,10 @@
                     </pic:cNvPicPr>
                   </pic:nvPicPr>
                   <pic:blipFill>
-                    <a:blip r:embed="rId49">
+                    <a:blip r:embed="rId50">
                       <a:extLst>
                         <a:ext uri="{96DAC541-7B7A-43D3-8B79-37D633B846F1}">
-                          <asvg:svgBlip xmlns:asvg="http://schemas.microsoft.com/office/drawing/2016/SVG/main" r:embed="rId50"/>
+                          <asvg:svgBlip xmlns:asvg="http://schemas.microsoft.com/office/drawing/2016/SVG/main" r:embed="rId51"/>
                         </a:ext>
                       </a:extLst>
                     </a:blip>
@@ -3148,11 +3223,11 @@
       </w:pPr>
     </w:p>
     <w:sectPr>
-      <w:headerReference w:type="default" r:id="rId51"/>
-      <w:footerReference w:type="even" r:id="rId52"/>
-      <w:footerReference w:type="default" r:id="rId53"/>
-      <w:headerReference w:type="first" r:id="rId54"/>
-      <w:footerReference w:type="first" r:id="rId55"/>
+      <w:headerReference w:type="default" r:id="rId52"/>
+      <w:footerReference w:type="even" r:id="rId53"/>
+      <w:footerReference w:type="default" r:id="rId54"/>
+      <w:headerReference w:type="first" r:id="rId55"/>
+      <w:footerReference w:type="first" r:id="rId56"/>
       <w:pgSz w:w="11900" w:h="16840"/>
       <w:pgMar w:top="1440" w:right="1671" w:bottom="1440" w:left="1440" w:header="1020" w:footer="283" w:gutter="0"/>
       <w:cols w:space="708"/>
@@ -10743,24 +10818,6 @@
 </file>
 
 <file path=customXml/item1.xml><?xml version="1.0" encoding="utf-8"?>
-<p:properties xmlns:p="http://schemas.microsoft.com/office/2006/metadata/properties" xmlns:xsi="http://www.w3.org/2001/XMLSchema-instance" xmlns:pc="http://schemas.microsoft.com/office/infopath/2007/PartnerControls">
-  <documentManagement>
-    <SharedWithUsers xmlns="1e016552-a444-4155-9aae-f89f68456b2f">
-      <UserInfo>
-        <DisplayName/>
-        <AccountId xsi:nil="true"/>
-        <AccountType/>
-      </UserInfo>
-    </SharedWithUsers>
-    <lcf76f155ced4ddcb4097134ff3c332f xmlns="b569361e-f886-4987-bee7-742d96c8ef7f">
-      <Terms xmlns="http://schemas.microsoft.com/office/infopath/2007/PartnerControls"/>
-    </lcf76f155ced4ddcb4097134ff3c332f>
-    <TaxCatchAll xmlns="1e016552-a444-4155-9aae-f89f68456b2f" xsi:nil="true"/>
-  </documentManagement>
-</p:properties>
-</file>
-
-<file path=customXml/item2.xml><?xml version="1.0" encoding="utf-8"?>
 <ct:contentTypeSchema xmlns:ct="http://schemas.microsoft.com/office/2006/metadata/contentType" xmlns:ma="http://schemas.microsoft.com/office/2006/metadata/properties/metaAttributes" ct:_="" ma:_="" ma:contentTypeName="dokument" ma:contentTypeID="0x0101001CF7A146020B334CA8D4096E9D52BE8D" ma:contentTypeVersion="19" ma:contentTypeDescription="Skapa ett nytt dokument." ma:contentTypeScope="" ma:versionID="64d0ece939eb99a3046ac564725804b3">
   <xsd:schema xmlns:xsd="http://www.w3.org/2001/XMLSchema" xmlns:xs="http://www.w3.org/2001/XMLSchema" xmlns:p="http://schemas.microsoft.com/office/2006/metadata/properties" xmlns:ns2="1e016552-a444-4155-9aae-f89f68456b2f" xmlns:ns3="b569361e-f886-4987-bee7-742d96c8ef7f" targetNamespace="http://schemas.microsoft.com/office/2006/metadata/properties" ma:root="true" ma:fieldsID="e540ebeb37a856da56316949ceef340f" ns2:_="" ns3:_="">
     <xsd:import namespace="1e016552-a444-4155-9aae-f89f68456b2f"/>
@@ -11021,11 +11078,7 @@
 </ct:contentTypeSchema>
 </file>
 
-<file path=customXml/item3.xml><?xml version="1.0" encoding="utf-8"?>
-<b:Sources xmlns:b="http://schemas.openxmlformats.org/officeDocument/2006/bibliography" xmlns="http://schemas.openxmlformats.org/officeDocument/2006/bibliography" SelectedStyle="/APASixthEditionOfficeOnline.xsl" StyleName="APA" Version="6"/>
-</file>
-
-<file path=customXml/item4.xml><?xml version="1.0" encoding="utf-8"?>
+<file path=customXml/item2.xml><?xml version="1.0" encoding="utf-8"?>
 <?mso-contentType ?>
 <FormTemplates xmlns="http://schemas.microsoft.com/sharepoint/v3/contenttype/forms">
   <Display>DocumentLibraryForm</Display>
@@ -11034,18 +11087,29 @@
 </FormTemplates>
 </file>
 
-<file path=customXml/itemProps1.xml><?xml version="1.0" encoding="utf-8"?>
-<ds:datastoreItem xmlns:ds="http://schemas.openxmlformats.org/officeDocument/2006/customXml" ds:itemID="{C6EA9280-B8EF-4CAA-B982-F4D358E1DDD6}">
-  <ds:schemaRefs>
-    <ds:schemaRef ds:uri="http://schemas.microsoft.com/office/2006/metadata/properties"/>
-    <ds:schemaRef ds:uri="http://schemas.microsoft.com/office/infopath/2007/PartnerControls"/>
-    <ds:schemaRef ds:uri="1e016552-a444-4155-9aae-f89f68456b2f"/>
-    <ds:schemaRef ds:uri="b569361e-f886-4987-bee7-742d96c8ef7f"/>
-  </ds:schemaRefs>
-</ds:datastoreItem>
+<file path=customXml/item3.xml><?xml version="1.0" encoding="utf-8"?>
+<b:Sources xmlns:b="http://schemas.openxmlformats.org/officeDocument/2006/bibliography" xmlns="http://schemas.openxmlformats.org/officeDocument/2006/bibliography" SelectedStyle="/APASixthEditionOfficeOnline.xsl" StyleName="APA" Version="6"/>
 </file>
 
-<file path=customXml/itemProps2.xml><?xml version="1.0" encoding="utf-8"?>
+<file path=customXml/item4.xml><?xml version="1.0" encoding="utf-8"?>
+<p:properties xmlns:p="http://schemas.microsoft.com/office/2006/metadata/properties" xmlns:xsi="http://www.w3.org/2001/XMLSchema-instance" xmlns:pc="http://schemas.microsoft.com/office/infopath/2007/PartnerControls">
+  <documentManagement>
+    <SharedWithUsers xmlns="1e016552-a444-4155-9aae-f89f68456b2f">
+      <UserInfo>
+        <DisplayName/>
+        <AccountId xsi:nil="true"/>
+        <AccountType/>
+      </UserInfo>
+    </SharedWithUsers>
+    <lcf76f155ced4ddcb4097134ff3c332f xmlns="b569361e-f886-4987-bee7-742d96c8ef7f">
+      <Terms xmlns="http://schemas.microsoft.com/office/infopath/2007/PartnerControls"/>
+    </lcf76f155ced4ddcb4097134ff3c332f>
+    <TaxCatchAll xmlns="1e016552-a444-4155-9aae-f89f68456b2f" xsi:nil="true"/>
+  </documentManagement>
+</p:properties>
+</file>
+
+<file path=customXml/itemProps1.xml><?xml version="1.0" encoding="utf-8"?>
 <ds:datastoreItem xmlns:ds="http://schemas.openxmlformats.org/officeDocument/2006/customXml" ds:itemID="{5BD30851-02A6-42A9-A074-CA49E7C09FF7}">
   <ds:schemaRefs>
     <ds:schemaRef ds:uri="http://schemas.microsoft.com/office/2006/metadata/contentType"/>
@@ -11064,6 +11128,14 @@
 </ds:datastoreItem>
 </file>
 
+<file path=customXml/itemProps2.xml><?xml version="1.0" encoding="utf-8"?>
+<ds:datastoreItem xmlns:ds="http://schemas.openxmlformats.org/officeDocument/2006/customXml" ds:itemID="{59053834-B0DF-4F24-A08B-852ABC187C0A}">
+  <ds:schemaRefs>
+    <ds:schemaRef ds:uri="http://schemas.microsoft.com/sharepoint/v3/contenttype/forms"/>
+  </ds:schemaRefs>
+</ds:datastoreItem>
+</file>
+
 <file path=customXml/itemProps3.xml><?xml version="1.0" encoding="utf-8"?>
 <ds:datastoreItem xmlns:ds="http://schemas.openxmlformats.org/officeDocument/2006/customXml" ds:itemID="{DEAE1E06-A7B1-4B05-9A34-85AC3E4FFC1D}">
   <ds:schemaRefs>
@@ -11073,9 +11145,12 @@
 </file>
 
 <file path=customXml/itemProps4.xml><?xml version="1.0" encoding="utf-8"?>
-<ds:datastoreItem xmlns:ds="http://schemas.openxmlformats.org/officeDocument/2006/customXml" ds:itemID="{59053834-B0DF-4F24-A08B-852ABC187C0A}">
+<ds:datastoreItem xmlns:ds="http://schemas.openxmlformats.org/officeDocument/2006/customXml" ds:itemID="{C6EA9280-B8EF-4CAA-B982-F4D358E1DDD6}">
   <ds:schemaRefs>
-    <ds:schemaRef ds:uri="http://schemas.microsoft.com/sharepoint/v3/contenttype/forms"/>
+    <ds:schemaRef ds:uri="http://schemas.microsoft.com/office/2006/metadata/properties"/>
+    <ds:schemaRef ds:uri="http://schemas.microsoft.com/office/infopath/2007/PartnerControls"/>
+    <ds:schemaRef ds:uri="1e016552-a444-4155-9aae-f89f68456b2f"/>
+    <ds:schemaRef ds:uri="b569361e-f886-4987-bee7-742d96c8ef7f"/>
   </ds:schemaRefs>
 </ds:datastoreItem>
 </file>
</xml_diff>